<commit_message>
docs: d1_shipping_cost — regenerate user manual for v1.9
Bring Handleiding_Transportkosten.docx in sync with the module (was still
at v1.0). Updates:
- Weight banding per piece (TK1/TK2 heavy/mid/light pools)
- Qty x Length order line fields + product Use Quantity/Use Length
- Carrier determination (TK1 > TK3 > TK2) and carrier-product line
- UoM-aware piece weight for length products
- Skip calculation when customer has a fixed delivery method (v1.9)
- New appendices: carrier/weight details + change history

Co-Authored-By: Claude Opus 4.8 <noreply@anthropic.com>
</commit_message>
<xml_diff>
--- a/d1_shipping_cost/static/description/Handleiding_Transportkosten.docx
+++ b/d1_shipping_cost/static/description/Handleiding_Transportkosten.docx
@@ -41,7 +41,7 @@
         <w:rPr>
           <w:sz w:val="22"/>
         </w:rPr>
-        <w:t>Versie 1.0 — Juni 2026</w:t>
+        <w:t>Versie 1.9 — Juli 2026</w:t>
       </w:r>
     </w:p>
     <w:p>
@@ -134,7 +134,7 @@
         <w:spacing w:after="40"/>
       </w:pPr>
       <w:r>
-        <w:t>4. Transportkosten berekenen</w:t>
+        <w:t xml:space="preserve">   3.1 Transportvelden</w:t>
       </w:r>
     </w:p>
     <w:p>
@@ -142,7 +142,7 @@
         <w:spacing w:after="40"/>
       </w:pPr>
       <w:r>
-        <w:t xml:space="preserve">   4.1 Berekening starten</w:t>
+        <w:t xml:space="preserve">   3.2 Hoeveelheid × lengte (staaf-/lengteproducten)</w:t>
       </w:r>
     </w:p>
     <w:p>
@@ -150,7 +150,7 @@
         <w:spacing w:after="40"/>
       </w:pPr>
       <w:r>
-        <w:t xml:space="preserve">   4.2 Resultaat en palletberekening</w:t>
+        <w:t>4. Orderregels: Hoeveelheid en Lengte</w:t>
       </w:r>
     </w:p>
     <w:p>
@@ -158,7 +158,7 @@
         <w:spacing w:after="40"/>
       </w:pPr>
       <w:r>
-        <w:t xml:space="preserve">   4.3 Herberekening</w:t>
+        <w:t>5. Transportkosten berekenen</w:t>
       </w:r>
     </w:p>
     <w:p>
@@ -166,7 +166,47 @@
         <w:spacing w:after="40"/>
       </w:pPr>
       <w:r>
-        <w:t>5. Lijstweergave en filteren</w:t>
+        <w:t xml:space="preserve">   5.1 Berekening starten</w:t>
+      </w:r>
+    </w:p>
+    <w:p>
+      <w:pPr>
+        <w:spacing w:after="40"/>
+      </w:pPr>
+      <w:r>
+        <w:t xml:space="preserve">   5.2 Vaste verzendwijze klant (berekening overslaan)</w:t>
+      </w:r>
+    </w:p>
+    <w:p>
+      <w:pPr>
+        <w:spacing w:after="40"/>
+      </w:pPr>
+      <w:r>
+        <w:t xml:space="preserve">   5.3 Resultaat, transporteur en transportkostenregel</w:t>
+      </w:r>
+    </w:p>
+    <w:p>
+      <w:pPr>
+        <w:spacing w:after="40"/>
+      </w:pPr>
+      <w:r>
+        <w:t xml:space="preserve">   5.4 Palletberekening</w:t>
+      </w:r>
+    </w:p>
+    <w:p>
+      <w:pPr>
+        <w:spacing w:after="40"/>
+      </w:pPr>
+      <w:r>
+        <w:t xml:space="preserve">   5.5 Herberekening</w:t>
+      </w:r>
+    </w:p>
+    <w:p>
+      <w:pPr>
+        <w:spacing w:after="40"/>
+      </w:pPr>
+      <w:r>
+        <w:t>6. Lijstweergave en filteren</w:t>
       </w:r>
     </w:p>
     <w:p>
@@ -187,7 +227,23 @@
         <w:spacing w:after="40"/>
       </w:pPr>
       <w:r>
-        <w:t>Bijlage B — Open punten</w:t>
+        <w:t>Bijlage B — Transporteurbepaling en gewicht per stuk</w:t>
+      </w:r>
+    </w:p>
+    <w:p>
+      <w:pPr>
+        <w:spacing w:after="40"/>
+      </w:pPr>
+      <w:r>
+        <w:t>Bijlage C — Open punten</w:t>
+      </w:r>
+    </w:p>
+    <w:p>
+      <w:pPr>
+        <w:spacing w:after="40"/>
+      </w:pPr>
+      <w:r>
+        <w:t>Bijlage D — Wijzigingshistorie</w:t>
       </w:r>
     </w:p>
     <w:p>
@@ -405,7 +461,12 @@
     <w:p/>
     <w:p>
       <w:r>
-        <w:t>Per klasse wordt een apart deelproces doorlopen. De som van TK1 + TK2 + TK3 wordt als één transportkostenregel aan de order toegevoegd. Wanneer de kosten niet automatisch bepaald kunnen worden (bv. te veel bundels of te zwaar), wordt de order gemarkeerd voor handmatige palletberekening.</w:t>
+        <w:t>Per klasse wordt een apart deelproces doorlopen. De som van TK1 + TK2 + TK3 wordt als één transportkostenregel aan de order toegevoegd. Op basis van de gevonden tarieven wordt bovendien automatisch de transporteur (verzendwijze) op de order bepaald. Wanneer de kosten niet automatisch bepaald kunnen worden (bv. te veel bundels, te zwaar of een uitzonderingsmaat), wordt de order gemarkeerd voor handmatige palletberekening.</w:t>
+      </w:r>
+    </w:p>
+    <w:p>
+      <w:r>
+        <w:t>Heeft de klant zelf een vaste verzendwijze afgesproken, dan wordt de automatische berekening overgeslagen (zie §5.2).</w:t>
       </w:r>
     </w:p>
     <w:p>
@@ -435,6 +496,11 @@
       </w:pPr>
       <w:r>
         <w:t>odoo-bin -i d1_shipping_cost --stop-after-init --no-http</w:t>
+      </w:r>
+    </w:p>
+    <w:p>
+      <w:r>
+        <w:t>De module is afhankelijk van de standaardmodules Verkoop (sale_management), Levering (delivery) en Producten (product). De koppeling met Levering is nodig voor de transporteurs (delivery.carrier) en de vaste verzendwijze per klant.</w:t>
       </w:r>
     </w:p>
     <w:p/>
@@ -886,7 +952,7 @@
     </w:p>
     <w:p>
       <w:r>
-        <w:t>Hier worden de tariefstaffels beheerd. Elk tarief koppelt een transportklasse, optioneel een lengteklasse, een eenheidsstaffel (van/t.m.) en een adresfilter aan een prijs.</w:t>
+        <w:t>Hier worden de tariefstaffels beheerd. Elk tarief koppelt een transportklasse, optioneel een lengteklasse, een eenheidsstaffel (van/t.m.), een adresfilter en een transporteur aan een prijs.</w:t>
       </w:r>
     </w:p>
     <w:tbl>
@@ -1067,6 +1133,28 @@
           </w:tcPr>
           <w:p>
             <w:r>
+              <w:t>Transporteur</w:t>
+            </w:r>
+          </w:p>
+        </w:tc>
+        <w:tc>
+          <w:tcPr>
+            <w:tcW w:type="dxa" w:w="4320"/>
+          </w:tcPr>
+          <w:p>
+            <w:r>
+              <w:t>De verzendwijze (delivery.carrier) die bij dit tarief hoort. Bepaalt de transporteur op de order (zie Bijlage B).</w:t>
+            </w:r>
+          </w:p>
+        </w:tc>
+      </w:tr>
+      <w:tr>
+        <w:tc>
+          <w:tcPr>
+            <w:tcW w:type="dxa" w:w="4320"/>
+          </w:tcPr>
+          <w:p>
+            <w:r>
               <w:t>Landen</w:t>
             </w:r>
           </w:p>
@@ -1167,7 +1255,7 @@
     </w:p>
     <w:p>
       <w:r>
-        <w:t>Als alle drie leeg zijn, geldt het tarief als generiek (voor alle adressen). Reguliere expressies worden ondersteund in postcode-prefixen.</w:t>
+        <w:t>Als alle drie leeg zijn, geldt het tarief als generiek (voor alle adressen). Reguliere expressies worden ondersteund in postcode-prefixen. Bij meerdere passende tarieven wint het meest specifieke adresfilter (postcode &gt; provincie &gt; land &gt; generiek).</w:t>
       </w:r>
     </w:p>
     <w:p>
@@ -1424,7 +1512,7 @@
           </w:tcPr>
           <w:p>
             <w:r>
-              <w:t>Boven deze waarde → palletberekening</w:t>
+              <w:t>Vanaf dit aantal bundels → palletberekening</w:t>
             </w:r>
           </w:p>
         </w:tc>
@@ -1520,7 +1608,7 @@
           </w:tcPr>
           <w:p>
             <w:r>
-              <w:t>Max gewicht per bundel</w:t>
+              <w:t>Max gewicht per bundel (ook gebruikt voor gewichtsbanding)</w:t>
             </w:r>
           </w:p>
         </w:tc>
@@ -1552,7 +1640,7 @@
           </w:tcPr>
           <w:p>
             <w:r>
-              <w:t>Boven dit totaalgewicht → palletberekening</w:t>
+              <w:t>Vanaf dit totaalgewicht → palletberekening</w:t>
             </w:r>
           </w:p>
         </w:tc>
@@ -1584,7 +1672,7 @@
           </w:tcPr>
           <w:p>
             <w:r>
-              <w:t>Boven dit totaalgewicht → palletberekening</w:t>
+              <w:t>Vanaf dit totaalgewicht → palletberekening</w:t>
             </w:r>
           </w:p>
         </w:tc>
@@ -1616,7 +1704,7 @@
           </w:tcPr>
           <w:p>
             <w:r>
-              <w:t>Max gewicht per doos (TK2/TK3)</w:t>
+              <w:t>Max gewicht per doos (TK2/TK3, ook voor gewichtsbanding)</w:t>
             </w:r>
           </w:p>
         </w:tc>
@@ -1634,6 +1722,14 @@
       </w:pPr>
       <w:r>
         <w:t>3. Producten configureren</w:t>
+      </w:r>
+    </w:p>
+    <w:p>
+      <w:pPr>
+        <w:pStyle w:val="Heading2"/>
+      </w:pPr>
+      <w:r>
+        <w:t>3.1 Transportvelden</w:t>
       </w:r>
     </w:p>
     <w:p>
@@ -1773,11 +1869,102 @@
           </w:p>
         </w:tc>
       </w:tr>
+      <w:tr>
+        <w:tc>
+          <w:tcPr>
+            <w:tcW w:type="dxa" w:w="4320"/>
+          </w:tcPr>
+          <w:p>
+            <w:r>
+              <w:t>Gebruik Hoeveelheid</w:t>
+            </w:r>
+          </w:p>
+        </w:tc>
+        <w:tc>
+          <w:tcPr>
+            <w:tcW w:type="dxa" w:w="4320"/>
+          </w:tcPr>
+          <w:p>
+            <w:r>
+              <w:t>Aan = de orderregel-hoeveelheid wordt berekend als Hoeveelheid × Lengte (zie §3.2 en §4).</w:t>
+            </w:r>
+          </w:p>
+        </w:tc>
+      </w:tr>
+      <w:tr>
+        <w:tc>
+          <w:tcPr>
+            <w:tcW w:type="dxa" w:w="4320"/>
+          </w:tcPr>
+          <w:p>
+            <w:r>
+              <w:t>Gebruik Lengte</w:t>
+            </w:r>
+          </w:p>
+        </w:tc>
+        <w:tc>
+          <w:tcPr>
+            <w:tcW w:type="dxa" w:w="4320"/>
+          </w:tcPr>
+          <w:p>
+            <w:r>
+              <w:t>Aan = de gebruiker mag op de orderregel een eigen lengte invoeren. Uit = de productlengte wordt gebruikt.</w:t>
+            </w:r>
+          </w:p>
+        </w:tc>
+      </w:tr>
     </w:tbl>
     <w:p/>
     <w:p>
       <w:r>
-        <w:t>Het gewicht wordt gelezen uit het standaard Odoo-veld Gewicht (kg) op het product. Dit hoeft niet apart ingesteld te worden op het Transport-tabblad.</w:t>
+        <w:t>Het gewicht wordt gelezen uit het standaard Odoo-veld Gewicht op het product. Dit hoeft niet apart ingesteld te worden op het Transport-tabblad.</w:t>
+      </w:r>
+    </w:p>
+    <w:p>
+      <w:pPr>
+        <w:pStyle w:val="Heading2"/>
+      </w:pPr>
+      <w:r>
+        <w:t>3.2 Hoeveelheid × lengte (staaf-/lengteproducten)</w:t>
+      </w:r>
+    </w:p>
+    <w:p>
+      <w:r>
+        <w:t>Voor producten die per lengte-eenheid worden verkocht (bijvoorbeeld per meter) kan het handig zijn om op de orderregel het aantal stuks én de lengte per stuk apart in te voeren. Zet daarvoor op het product Gebruik Hoeveelheid aan.</w:t>
+      </w:r>
+    </w:p>
+    <w:p>
+      <w:r>
+        <w:t>Gedrag:</w:t>
+      </w:r>
+    </w:p>
+    <w:p>
+      <w:pPr>
+        <w:pStyle w:val="ListBullet"/>
+      </w:pPr>
+      <w:r>
+        <w:t>• Gebruik Hoeveelheid aan, Gebruik Lengte uit → de lengte wordt automatisch overgenomen van de productlengte (in meters). De besteleenheid (Aantal) wordt berekend als Hoeveelheid × Lengte.</w:t>
+      </w:r>
+    </w:p>
+    <w:p>
+      <w:pPr>
+        <w:pStyle w:val="ListBullet"/>
+      </w:pPr>
+      <w:r>
+        <w:t>• Gebruik Hoeveelheid aan, Gebruik Lengte aan → de gebruiker voert zelf een lengte per stuk in op de orderregel. Aantal = Hoeveelheid × Lengte.</w:t>
+      </w:r>
+    </w:p>
+    <w:p>
+      <w:pPr>
+        <w:pStyle w:val="ListBullet"/>
+      </w:pPr>
+      <w:r>
+        <w:t>• Gebruik Hoeveelheid uit → normaal gedrag: de gebruiker voert het Aantal handmatig in.</w:t>
+      </w:r>
+    </w:p>
+    <w:p>
+      <w:r>
+        <w:t>Bij de gewichtsberekening houdt de module rekening met de maateenheid van het product: is het product een lengte-eenheid (m, cm, mm …), dan wordt het productgewicht (per eenheid) vermenigvuldigd met de lengte om het werkelijke stukgewicht te bepalen (zie Bijlage B).</w:t>
       </w:r>
     </w:p>
     <w:p>
@@ -1785,7 +1972,110 @@
         <w:pStyle w:val="Heading1"/>
       </w:pPr>
       <w:r>
-        <w:t>4. Transportkosten berekenen</w:t>
+        <w:t>4. Orderregels: Hoeveelheid en Lengte</w:t>
+      </w:r>
+    </w:p>
+    <w:p>
+      <w:r>
+        <w:t>Op de orderregels van een offerte/verkooporder zijn twee extra kolommen beschikbaar (standaard zichtbaar, in te klappen via het kolommenmenu):</w:t>
+      </w:r>
+    </w:p>
+    <w:tbl>
+      <w:tblPr>
+        <w:tblStyle w:val="LightGrid-Accent1"/>
+        <w:tblW w:type="auto" w:w="0"/>
+        <w:jc w:val="left"/>
+        <w:tblLook w:firstColumn="1" w:firstRow="1" w:lastColumn="0" w:lastRow="0" w:noHBand="0" w:noVBand="1" w:val="04A0"/>
+      </w:tblPr>
+      <w:tblGrid>
+        <w:gridCol w:w="4320"/>
+        <w:gridCol w:w="4320"/>
+      </w:tblGrid>
+      <w:tr>
+        <w:tc>
+          <w:tcPr>
+            <w:tcW w:type="dxa" w:w="4320"/>
+          </w:tcPr>
+          <w:p>
+            <w:r>
+              <w:rPr>
+                <w:b/>
+              </w:rPr>
+              <w:t>Kolom</w:t>
+            </w:r>
+          </w:p>
+        </w:tc>
+        <w:tc>
+          <w:tcPr>
+            <w:tcW w:type="dxa" w:w="4320"/>
+          </w:tcPr>
+          <w:p>
+            <w:r>
+              <w:rPr>
+                <w:b/>
+              </w:rPr>
+              <w:t>Omschrijving</w:t>
+            </w:r>
+          </w:p>
+        </w:tc>
+      </w:tr>
+      <w:tr>
+        <w:tc>
+          <w:tcPr>
+            <w:tcW w:type="dxa" w:w="4320"/>
+          </w:tcPr>
+          <w:p>
+            <w:r>
+              <w:t>Hoeveelheid</w:t>
+            </w:r>
+          </w:p>
+        </w:tc>
+        <w:tc>
+          <w:tcPr>
+            <w:tcW w:type="dxa" w:w="4320"/>
+          </w:tcPr>
+          <w:p>
+            <w:r>
+              <w:t>Aantal stuks. Alleen invoerbaar bij producten met 'Gebruik Hoeveelheid' aan.</w:t>
+            </w:r>
+          </w:p>
+        </w:tc>
+      </w:tr>
+      <w:tr>
+        <w:tc>
+          <w:tcPr>
+            <w:tcW w:type="dxa" w:w="4320"/>
+          </w:tcPr>
+          <w:p>
+            <w:r>
+              <w:t>Lengte</w:t>
+            </w:r>
+          </w:p>
+        </w:tc>
+        <w:tc>
+          <w:tcPr>
+            <w:tcW w:type="dxa" w:w="4320"/>
+          </w:tcPr>
+          <w:p>
+            <w:r>
+              <w:t>Lengte per stuk (in meters). Alleen invoerbaar bij producten met 'Gebruik Lengte' aan; anders automatisch gevuld vanuit het product.</w:t>
+            </w:r>
+          </w:p>
+        </w:tc>
+      </w:tr>
+    </w:tbl>
+    <w:p/>
+    <w:p>
+      <w:r>
+        <w:t>Wanneer 'Gebruik Hoeveelheid' actief is, wordt het standaard Odoo-veld Aantal automatisch berekend als Hoeveelheid × Lengte. Deze berekening werkt zowel in de UI (bij het wijzigen van velden) als bij het aanmaken/wijzigen van regels via import of API.</w:t>
+      </w:r>
+    </w:p>
+    <w:p>
+      <w:pPr>
+        <w:pStyle w:val="Heading1"/>
+      </w:pPr>
+      <w:r>
+        <w:t>5. Transportkosten berekenen</w:t>
       </w:r>
     </w:p>
     <w:p>
@@ -1793,7 +2083,7 @@
         <w:pStyle w:val="Heading2"/>
       </w:pPr>
       <w:r>
-        <w:t>4.1 Berekening starten</w:t>
+        <w:t>5.1 Berekening starten</w:t>
       </w:r>
     </w:p>
     <w:p>
@@ -1811,12 +2101,55 @@
         <w:pStyle w:val="Heading2"/>
       </w:pPr>
       <w:r>
-        <w:t>4.2 Resultaat en palletberekening</w:t>
+        <w:t>5.2 Vaste verzendwijze klant (berekening overslaan)</w:t>
       </w:r>
     </w:p>
     <w:p>
       <w:r>
-        <w:t>Na de berekening verschijnt onder de orderregels:</w:t>
+        <w:t>Heeft de klant een vaste verzendwijze afgesproken, dan hoeft de module niets te berekenen. Dit wordt bepaald via het standaardveld Verzendwijze (property_delivery_carrier_id) op de klant (tabblad Verkoop &amp; Aankoop van de contactpersoon).</w:t>
+      </w:r>
+    </w:p>
+    <w:p>
+      <w:r>
+        <w:t>Als dit veld gevuld is en je klikt op "Bereken transportkosten", dan wordt de TK1/TK2/TK3-berekening volledig overgeslagen. Er wordt géén transportkostenregel toegevoegd en er verschijnt een bericht in de Chatter, bijvoorbeeld:</w:t>
+      </w:r>
+    </w:p>
+    <w:p>
+      <w:pPr>
+        <w:pStyle w:val="NoSpacing"/>
+      </w:pPr>
+      <w:r>
+        <w:rPr>
+          <w:b/>
+        </w:rPr>
+        <w:t>Transportkostenberekening</w:t>
+      </w:r>
+    </w:p>
+    <w:p>
+      <w:pPr>
+        <w:pStyle w:val="NoSpacing"/>
+      </w:pPr>
+      <w:r>
+        <w:t>Verzendwijze klant: &lt;naam verzendwijze&gt;, transportkostenberekening overgeslagen</w:t>
+      </w:r>
+    </w:p>
+    <w:p/>
+    <w:p>
+      <w:r>
+        <w:t>Alleen wanneer de klant géén vaste verzendwijze heeft, wordt de automatische berekening uitgevoerd.</w:t>
+      </w:r>
+    </w:p>
+    <w:p>
+      <w:pPr>
+        <w:pStyle w:val="Heading2"/>
+      </w:pPr>
+      <w:r>
+        <w:t>5.3 Resultaat, transporteur en transportkostenregel</w:t>
+      </w:r>
+    </w:p>
+    <w:p>
+      <w:r>
+        <w:t>Na een uitgevoerde berekening verschijnt onder de orderregels:</w:t>
       </w:r>
     </w:p>
     <w:p>
@@ -1824,7 +2157,7 @@
         <w:pStyle w:val="ListBullet"/>
       </w:pPr>
       <w:r>
-        <w:t>• Een samenvattingsveld met per klasse het resultaat (aantal bundels/dozen, tarief, of reden voor handmatige berekening)</w:t>
+        <w:t>• Een samenvattingsveld (Transport berekening) met per klasse het resultaat (aantal bundels/dozen, tarief, of reden voor handmatige berekening).</w:t>
       </w:r>
     </w:p>
     <w:p>
@@ -1832,7 +2165,7 @@
         <w:pStyle w:val="ListBullet"/>
       </w:pPr>
       <w:r>
-        <w:t>• Het veld Palletberekening (checkbox) — aangevinkt wanneer de kosten niet automatisch bepaald konden worden</w:t>
+        <w:t>• De bepaalde transporteur. De module kiest de transporteur op basis van de gevonden tarieven, met prioriteit TK1 &gt; TK3 &gt; TK2 (zie Bijlage B). De transporteur wordt op de order gezet (veld Verzendwijze / carrier_id).</w:t>
       </w:r>
     </w:p>
     <w:p>
@@ -1840,12 +2173,20 @@
         <w:pStyle w:val="ListBullet"/>
       </w:pPr>
       <w:r>
-        <w:t>• Een chatterbericht met dezelfde samenvatting (voor audit trail)</w:t>
+        <w:t>• Eén transportkostenregel onderaan de order. Als product wordt het product van de gekozen transporteur gebruikt; de regel krijgt de markering [TRANSPORT] en het totaalbedrag als prijs.</w:t>
+      </w:r>
+    </w:p>
+    <w:p>
+      <w:pPr>
+        <w:pStyle w:val="ListBullet"/>
+      </w:pPr>
+      <w:r>
+        <w:t>• Een chatterbericht met dezelfde samenvatting (voor audit trail).</w:t>
       </w:r>
     </w:p>
     <w:p>
       <w:r>
-        <w:t>Wanneer Palletberekening is aangevinkt, wordt er géén transportkostenregel toegevoegd. De order moet dan handmatig beoordeeld worden.</w:t>
+        <w:t>Let op: is er geen transporteur (of geen product op de transporteur) bepaald terwijl er wel kosten zijn, dan geeft de module een foutmelding en wordt er geen regel aangemaakt. Controleer in dat geval de tarieven en de transporteur-configuratie.</w:t>
       </w:r>
     </w:p>
     <w:p>
@@ -1853,12 +2194,30 @@
         <w:pStyle w:val="Heading2"/>
       </w:pPr>
       <w:r>
-        <w:t>4.3 Herberekening</w:t>
+        <w:t>5.4 Palletberekening</w:t>
       </w:r>
     </w:p>
     <w:p>
       <w:r>
-        <w:t>Bij het opnieuw klikken op "Bereken transportkosten" wordt de bestaande transportkostenregel automatisch verwijderd en vervangen door een nieuwe berekening. Er worden dus nooit dubbele transportkostenregels aangemaakt.</w:t>
+        <w:t>Het veld Palletberekening (checkbox) wordt aangevinkt wanneer de kosten niet automatisch bepaald konden worden — bijvoorbeeld bij te veel bundels, te zwaar, een ontbrekend tarief of een TK3-uitzonderingsmaat.</w:t>
+      </w:r>
+    </w:p>
+    <w:p>
+      <w:r>
+        <w:t>Wanneer Palletberekening is aangevinkt, wordt er géén (of slechts een gedeeltelijke) automatische transportkostenregel toegevoegd voor het handmatige deel. De order moet dan handmatig beoordeeld worden. De samenvatting vermeldt precies welk onderdeel handmatige behandeling vereist.</w:t>
+      </w:r>
+    </w:p>
+    <w:p>
+      <w:pPr>
+        <w:pStyle w:val="Heading2"/>
+      </w:pPr>
+      <w:r>
+        <w:t>5.5 Herberekening</w:t>
+      </w:r>
+    </w:p>
+    <w:p>
+      <w:r>
+        <w:t>Bij het opnieuw klikken op "Bereken transportkosten" wordt de bestaande transportkostenregel (herkend aan de [TRANSPORT]-markering) automatisch verwijderd en vervangen door een nieuwe berekening. Er worden dus nooit dubbele transportkostenregels aangemaakt.</w:t>
       </w:r>
     </w:p>
     <w:p>
@@ -1866,7 +2225,7 @@
         <w:pStyle w:val="Heading1"/>
       </w:pPr>
       <w:r>
-        <w:t>5. Lijstweergave en filteren</w:t>
+        <w:t>6. Lijstweergave en filteren</w:t>
       </w:r>
     </w:p>
     <w:p>
@@ -1897,7 +2256,7 @@
     </w:p>
     <w:p>
       <w:r>
-        <w:t>Invoer: alle orderregels met transportklasse TK1. Per product zijn breedte, hoogte, lengte (cm) en gewicht (kg) bekend.</w:t>
+        <w:t>Invoer: alle orderregels met transportklasse TK1. Per product zijn breedte, hoogte, lengte (cm) en gewicht (kg) bekend. Het aantal stuks komt uit het veld Hoeveelheid (bij 'Gebruik Hoeveelheid') of anders uit Aantal.</w:t>
       </w:r>
     </w:p>
     <w:p>
@@ -1905,12 +2264,54 @@
         <w:pStyle w:val="Heading3"/>
       </w:pPr>
       <w:r>
-        <w:t>Stap a) Buizen per bundel</w:t>
+        <w:t>Stap 1) Gewichtsbanding per stuk</w:t>
       </w:r>
     </w:p>
     <w:p>
       <w:r>
-        <w:t>Per product wordt berekend hoeveel stuks in de dwarsdoorsnede van een standaardbundel passen:</w:t>
+        <w:t>Vóór de bundelberekening worden de stuks op basis van het stukgewicht in drie banden verdeeld (max = Max gewicht bundel, standaard 20 kg):</w:t>
+      </w:r>
+    </w:p>
+    <w:p>
+      <w:pPr>
+        <w:pStyle w:val="ListBullet"/>
+      </w:pPr>
+      <w:r>
+        <w:t>• Stukgewicht &gt;= max → de volledige TK1-klasse gaat naar PALLETBEREKENING.</w:t>
+      </w:r>
+    </w:p>
+    <w:p>
+      <w:pPr>
+        <w:pStyle w:val="ListBullet"/>
+      </w:pPr>
+      <w:r>
+        <w:t>• max/2 &lt;= stukgewicht &lt; max → 'één-per-bundel'-pool: elk stuk vormt een eigen bundel.</w:t>
+      </w:r>
+    </w:p>
+    <w:p>
+      <w:pPr>
+        <w:pStyle w:val="ListBullet"/>
+      </w:pPr>
+      <w:r>
+        <w:t>• Stukgewicht &lt; max/2 → normale (geometrische) pool.</w:t>
+      </w:r>
+    </w:p>
+    <w:p>
+      <w:r>
+        <w:t>Het stukgewicht houdt rekening met de maateenheid: bij lengteproducten is dat productgewicht × lengte (zie Bijlage B).</w:t>
+      </w:r>
+    </w:p>
+    <w:p>
+      <w:pPr>
+        <w:pStyle w:val="Heading3"/>
+      </w:pPr>
+      <w:r>
+        <w:t>Stap 2) Buizen per bundel (normale pool)</w:t>
+      </w:r>
+    </w:p>
+    <w:p>
+      <w:r>
+        <w:t>Per product in de normale pool wordt berekend hoeveel stuks in de dwarsdoorsnede van een standaardbundel passen:</w:t>
       </w:r>
     </w:p>
     <w:p>
@@ -1952,27 +2353,14 @@
       </w:r>
     </w:p>
     <w:p>
-      <w:pPr>
-        <w:pStyle w:val="Heading3"/>
-      </w:pPr>
-      <w:r>
-        <w:t>Stap b) Voorlopig aantal bundels</w:t>
-      </w:r>
-    </w:p>
-    <w:p>
       <w:r>
         <w:rPr>
           <w:b/>
         </w:rPr>
-        <w:t>bundels_voorlopig</w:t>
+        <w:t>bundels_normaal</w:t>
       </w:r>
       <w:r>
-        <w:t xml:space="preserve"> = ceil(totaal_aantal_stuks / buizen_per_bundel)</w:t>
-      </w:r>
-    </w:p>
-    <w:p>
-      <w:r>
-        <w:t>ceil = naar boven afronden.</w:t>
+        <w:t xml:space="preserve"> = ceil(aantal_stuks / buizen_per_bundel), per product opgeteld</w:t>
       </w:r>
     </w:p>
     <w:p>
@@ -1980,7 +2368,7 @@
         <w:pStyle w:val="Heading3"/>
       </w:pPr>
       <w:r>
-        <w:t>Stap c) Gewichtscorrectie</w:t>
+        <w:t>Stap 3) Gewichtscorrectie (normale pool)</w:t>
       </w:r>
     </w:p>
     <w:p>
@@ -1993,7 +2381,7 @@
         <w:pStyle w:val="ListBullet"/>
       </w:pPr>
       <w:r>
-        <w:t>• Als (totaal_gewicht / bundels_voorlopig) &lt; max_gewicht_bundel → aantal_bundels = bundels_voorlopig</w:t>
+        <w:t>• Als (gewicht_normale_pool / bundels_normaal) &lt; max_gewicht_bundel → bundels_normaal blijft ongewijzigd.</w:t>
       </w:r>
     </w:p>
     <w:p>
@@ -2001,7 +2389,7 @@
         <w:pStyle w:val="ListBullet"/>
       </w:pPr>
       <w:r>
-        <w:t>• Anders → aantal_bundels = ceil(totaal_gewicht / max_gewicht_bundel)</w:t>
+        <w:t>• Anders → bundels_normaal = ceil(gewicht_normale_pool / max_gewicht_bundel).</w:t>
       </w:r>
     </w:p>
     <w:p>
@@ -2009,7 +2397,26 @@
         <w:pStyle w:val="Heading3"/>
       </w:pPr>
       <w:r>
-        <w:t>Stap d) Drempelbeslissing</w:t>
+        <w:t>Stap 4) Totaal bundels</w:t>
+      </w:r>
+    </w:p>
+    <w:p>
+      <w:r>
+        <w:rPr>
+          <w:b/>
+        </w:rPr>
+        <w:t>totaal_bundels</w:t>
+      </w:r>
+      <w:r>
+        <w:t xml:space="preserve"> = bundels_één-per-bundel + bundels_normaal</w:t>
+      </w:r>
+    </w:p>
+    <w:p>
+      <w:pPr>
+        <w:pStyle w:val="Heading3"/>
+      </w:pPr>
+      <w:r>
+        <w:t>Stap 5) Drempel- en tariefbeslissing</w:t>
       </w:r>
     </w:p>
     <w:p>
@@ -2017,7 +2424,7 @@
         <w:pStyle w:val="ListBullet"/>
       </w:pPr>
       <w:r>
-        <w:t>• Als aantal_bundels &gt;= TK1 max bundels (instelbaar) → PALLETBEREKENING (handmatig). Geen automatische prijs.</w:t>
+        <w:t>• Als totaal_bundels &gt;= TK1 max bundels (instelbaar) → PALLETBEREKENING (handmatig). Geen automatische prijs.</w:t>
       </w:r>
     </w:p>
     <w:p>
@@ -2025,7 +2432,7 @@
         <w:pStyle w:val="ListBullet"/>
       </w:pPr>
       <w:r>
-        <w:t>• Anders → bepaal de lengteklasse op basis van de maximale productlengte in de order (opzoeking in de tabel Lengteklassen) en zoek het tarief op in de Transporttarieven (klasse TK1 + lengteklasse + staffel + adresfilter).</w:t>
+        <w:t>• Anders → bepaal de lengteklasse op basis van de maximale productlengte in de order (opzoeking in de tabel Lengteklassen) en zoek het tarief op in de Transporttarieven (klasse TK1 + lengteklasse + staffel + adresfilter). Uit het tarief volgt tevens de transporteur.</w:t>
       </w:r>
     </w:p>
     <w:p>
@@ -2092,7 +2499,7 @@
           </w:tcPr>
           <w:p>
             <w:r>
-              <w:t>Aluminium buis 60×3 mm, lengte 150 cm, gewicht 2 kg</w:t>
+              <w:t>Aluminium buis 60×3 mm, lengte 150 cm, gewicht 2 kg/stuk</w:t>
             </w:r>
           </w:p>
         </w:tc>
@@ -2175,7 +2582,7 @@
         <w:pStyle w:val="ListNumber"/>
       </w:pPr>
       <w:r>
-        <w:t>1. buizen_in_breedte = floor(15 / 3.0) = 5</w:t>
+        <w:t>1. stukgewicht 2 kg &lt; 10 (= 20/2) → normale pool</w:t>
       </w:r>
     </w:p>
     <w:p>
@@ -2183,7 +2590,7 @@
         <w:pStyle w:val="ListNumber"/>
       </w:pPr>
       <w:r>
-        <w:t>2. buizen_in_hoogte = floor(15 / 3.0) = 5</w:t>
+        <w:t>2. buizen_in_breedte = floor(15 / 3.0) = 5</w:t>
       </w:r>
     </w:p>
     <w:p>
@@ -2191,7 +2598,7 @@
         <w:pStyle w:val="ListNumber"/>
       </w:pPr>
       <w:r>
-        <w:t>3. buizen_per_bundel = 5 × 5 = 25</w:t>
+        <w:t>3. buizen_in_hoogte = floor(15 / 3.0) = 5</w:t>
       </w:r>
     </w:p>
     <w:p>
@@ -2199,7 +2606,7 @@
         <w:pStyle w:val="ListNumber"/>
       </w:pPr>
       <w:r>
-        <w:t>4. bundels_voorlopig = ceil(50 / 25) = 2</w:t>
+        <w:t>4. buizen_per_bundel = 5 × 5 = 25</w:t>
       </w:r>
     </w:p>
     <w:p>
@@ -2207,7 +2614,7 @@
         <w:pStyle w:val="ListNumber"/>
       </w:pPr>
       <w:r>
-        <w:t>5. totaal_gewicht = 50 × 2 = 100 kg</w:t>
+        <w:t>5. bundels_normaal = ceil(50 / 25) = 2</w:t>
       </w:r>
     </w:p>
     <w:p>
@@ -2215,7 +2622,7 @@
         <w:pStyle w:val="ListNumber"/>
       </w:pPr>
       <w:r>
-        <w:t>6. gemiddeld gewicht/bundel = 100 / 2 = 50 kg &gt; 20 kg → correctie!</w:t>
+        <w:t>6. gewicht_normale_pool = 50 × 2 = 100 kg</w:t>
       </w:r>
     </w:p>
     <w:p>
@@ -2223,7 +2630,7 @@
         <w:pStyle w:val="ListNumber"/>
       </w:pPr>
       <w:r>
-        <w:t>7. aantal_bundels = ceil(100 / 20) = 5 bundels</w:t>
+        <w:t>7. gemiddeld gewicht/bundel = 100 / 2 = 50 kg &gt; 20 kg → correctie!</w:t>
       </w:r>
     </w:p>
     <w:p>
@@ -2231,7 +2638,7 @@
         <w:pStyle w:val="ListNumber"/>
       </w:pPr>
       <w:r>
-        <w:t>8. max lengte = 150 cm → lengteklasse '&lt; 1,65 m'</w:t>
+        <w:t>8. bundels_normaal = ceil(100 / 20) = 5 → totaal_bundels = 5</w:t>
       </w:r>
     </w:p>
     <w:p>
@@ -2239,7 +2646,15 @@
         <w:pStyle w:val="ListNumber"/>
       </w:pPr>
       <w:r>
-        <w:t>9. Tariefopzoeking: TK1, &lt; 1,65 m, 5 bundels → € 25,00</w:t>
+        <w:t>9. max lengte = 150 cm → lengteklasse '&lt; 1,65 m'</w:t>
+      </w:r>
+    </w:p>
+    <w:p>
+      <w:pPr>
+        <w:pStyle w:val="ListNumber"/>
+      </w:pPr>
+      <w:r>
+        <w:t>10. Tariefopzoeking: TK1, &lt; 1,65 m, 5 bundels → € 25,00 (+ transporteur)</w:t>
       </w:r>
     </w:p>
     <w:p/>
@@ -2261,7 +2676,7 @@
         <w:pStyle w:val="Heading3"/>
       </w:pPr>
       <w:r>
-        <w:t>Stap 1) Gewichtsdrempel</w:t>
+        <w:t>Stap 1) Totaalgewicht-drempel</w:t>
       </w:r>
     </w:p>
     <w:p>
@@ -2277,7 +2692,44 @@
         <w:pStyle w:val="Heading3"/>
       </w:pPr>
       <w:r>
-        <w:t>Stap 2) Doosberekening</w:t>
+        <w:t>Stap 2) Gewichtsbanding per stuk</w:t>
+      </w:r>
+    </w:p>
+    <w:p>
+      <w:r>
+        <w:t>Per stuk wordt op basis van het stukgewicht ingedeeld (max = Max gewicht doos, standaard 20 kg):</w:t>
+      </w:r>
+    </w:p>
+    <w:p>
+      <w:pPr>
+        <w:pStyle w:val="ListBullet"/>
+      </w:pPr>
+      <w:r>
+        <w:t>• Stukgewicht &gt;= max → volledige TK2-klasse → PALLETBEREKENING.</w:t>
+      </w:r>
+    </w:p>
+    <w:p>
+      <w:pPr>
+        <w:pStyle w:val="ListBullet"/>
+      </w:pPr>
+      <w:r>
+        <w:t>• max/2 &lt;= stukgewicht &lt; max → 'één-per-doos'-pool: elk stuk in een eigen doos.</w:t>
+      </w:r>
+    </w:p>
+    <w:p>
+      <w:pPr>
+        <w:pStyle w:val="ListBullet"/>
+      </w:pPr>
+      <w:r>
+        <w:t>• Stukgewicht &lt; max/2 → lichte pool: gewichten worden opgeteld.</w:t>
+      </w:r>
+    </w:p>
+    <w:p>
+      <w:pPr>
+        <w:pStyle w:val="Heading3"/>
+      </w:pPr>
+      <w:r>
+        <w:t>Stap 3) Doosberekening en totaal</w:t>
       </w:r>
     </w:p>
     <w:p>
@@ -2285,10 +2737,21 @@
         <w:rPr>
           <w:b/>
         </w:rPr>
-        <w:t>aantal_dozen</w:t>
+        <w:t>dozen_normaal</w:t>
       </w:r>
       <w:r>
-        <w:t xml:space="preserve"> = ceil(totaal_gewicht / max_gewicht_doos)</w:t>
+        <w:t xml:space="preserve"> = ceil(gewicht_lichte_pool / max_gewicht_doos)</w:t>
+      </w:r>
+    </w:p>
+    <w:p>
+      <w:r>
+        <w:rPr>
+          <w:b/>
+        </w:rPr>
+        <w:t>totaal_dozen</w:t>
+      </w:r>
+      <w:r>
+        <w:t xml:space="preserve"> = dozen_één-per-doos + dozen_normaal</w:t>
       </w:r>
     </w:p>
     <w:p>
@@ -2296,12 +2759,12 @@
         <w:pStyle w:val="Heading3"/>
       </w:pPr>
       <w:r>
-        <w:t>Stap 3) Tariefopzoeking</w:t>
+        <w:t>Stap 4) Tariefopzoeking</w:t>
       </w:r>
     </w:p>
     <w:p>
       <w:r>
-        <w:t>Zoek in Transporttarieven: klasse TK2, staffel op aantal_dozen, adresfilter.</w:t>
+        <w:t>Zoek in Transporttarieven: klasse TK2, staffel op totaal_dozen, adresfilter. Uit het tarief volgt tevens de transporteur.</w:t>
       </w:r>
     </w:p>
     <w:p>
@@ -2368,7 +2831,7 @@
           </w:tcPr>
           <w:p>
             <w:r>
-              <w:t>Koppeling, gewicht 0,5 kg</w:t>
+              <w:t>Koppeling, gewicht 0,5 kg/stuk</w:t>
             </w:r>
           </w:p>
         </w:tc>
@@ -2437,7 +2900,7 @@
         <w:pStyle w:val="ListNumber"/>
       </w:pPr>
       <w:r>
-        <w:t>2. aantal_dozen = ceil(15 / 20) = 1 doos</w:t>
+        <w:t>2. stukgewicht 0,5 kg &lt; 10 → lichte pool</w:t>
       </w:r>
     </w:p>
     <w:p>
@@ -2445,7 +2908,15 @@
         <w:pStyle w:val="ListNumber"/>
       </w:pPr>
       <w:r>
-        <w:t>3. Tariefopzoeking: TK2, 1 doos → € 15,00</w:t>
+        <w:t>3. dozen_normaal = ceil(15 / 20) = 1 → totaal_dozen = 1</w:t>
+      </w:r>
+    </w:p>
+    <w:p>
+      <w:pPr>
+        <w:pStyle w:val="ListNumber"/>
+      </w:pPr>
+      <w:r>
+        <w:t>4. Tariefopzoeking: TK2, 1 doos → € 15,00 (+ transporteur)</w:t>
       </w:r>
     </w:p>
     <w:p/>
@@ -2541,7 +3012,7 @@
     </w:p>
     <w:p>
       <w:r>
-        <w:t>Tariefopzoeking: klasse TK3, staffel op aantal_dozen, adresfilter.</w:t>
+        <w:t>Tariefopzoeking: klasse TK3, staffel op aantal_dozen, adresfilter. Uit het tarief volgt tevens de transporteur.</w:t>
       </w:r>
     </w:p>
     <w:p>
@@ -2709,7 +3180,7 @@
         <w:pStyle w:val="ListNumber"/>
       </w:pPr>
       <w:r>
-        <w:t>6. Tariefopzoeking: TK3, 1 doos → € 20,00</w:t>
+        <w:t>6. Tariefopzoeking: TK3, 1 doos → € 20,00 (+ transporteur)</w:t>
       </w:r>
     </w:p>
     <w:p>
@@ -2722,7 +3193,85 @@
         <w:pStyle w:val="Heading1"/>
       </w:pPr>
       <w:r>
-        <w:t>Bijlage B — Open punten</w:t>
+        <w:t>Bijlage B — Transporteurbepaling en gewicht per stuk</w:t>
+      </w:r>
+    </w:p>
+    <w:p>
+      <w:pPr>
+        <w:pStyle w:val="Heading2"/>
+      </w:pPr>
+      <w:r>
+        <w:t>B.1 Transporteurbepaling</w:t>
+      </w:r>
+    </w:p>
+    <w:p>
+      <w:r>
+        <w:t>Elk transporttarief kan een transporteur (delivery.carrier) hebben. Tijdens de berekening levert elke klasse die een tarief vindt ook een transporteur op. De module kiest vervolgens één transporteur voor de hele order op basis van de volgende prioriteit:</w:t>
+      </w:r>
+    </w:p>
+    <w:p>
+      <w:r>
+        <w:rPr>
+          <w:b/>
+        </w:rPr>
+        <w:t>TK1 &gt; TK3 &gt; TK2</w:t>
+      </w:r>
+    </w:p>
+    <w:p>
+      <w:r>
+        <w:t>De eerste klasse (in deze volgorde) met een transporteur bepaalt de order-transporteur. De gekozen transporteur wordt op de order gezet (veld Verzendwijze / carrier_id) en het product van die transporteur wordt gebruikt voor de transportkostenregel.</w:t>
+      </w:r>
+    </w:p>
+    <w:p>
+      <w:r>
+        <w:t>Wordt er geen transporteur gevonden terwijl er wel klassen aanwezig zijn, dan vermeldt de samenvatting 'handmatig selecteren'.</w:t>
+      </w:r>
+    </w:p>
+    <w:p>
+      <w:pPr>
+        <w:pStyle w:val="Heading2"/>
+      </w:pPr>
+      <w:r>
+        <w:t>B.2 Gewicht per stuk bij lengteproducten</w:t>
+      </w:r>
+    </w:p>
+    <w:p>
+      <w:r>
+        <w:t>Het standaard Odoo-veld Gewicht is het gewicht per maateenheid van het product. Bij producten die per lengte worden verkocht (maateenheid m, cm, mm …) is dat dus het gewicht per meter, niet per stuk.</w:t>
+      </w:r>
+    </w:p>
+    <w:p>
+      <w:r>
+        <w:t>De module detecteert dit via de maateenheid van het product. Als het product een lengte-eenheid gebruikt én de orderregel een lengte heeft, wordt het stukgewicht berekend als:</w:t>
+      </w:r>
+    </w:p>
+    <w:p>
+      <w:r>
+        <w:rPr>
+          <w:b/>
+        </w:rPr>
+        <w:t>stukgewicht</w:t>
+      </w:r>
+      <w:r>
+        <w:t xml:space="preserve"> = gewicht_per_eenheid × lengte_in_producteenheid</w:t>
+      </w:r>
+    </w:p>
+    <w:p>
+      <w:r>
+        <w:t>Voorbeeld: een buis weegt 3 kg/m en is 2 m lang → stukgewicht = 6 kg. Dit stukgewicht wordt gebruikt in de gewichtsbanding (TK1/TK2) en de per-artikel checks (TK3). Voor producten die niet per lengte worden verkocht, blijft het gewicht simpelweg het productgewicht.</w:t>
+      </w:r>
+    </w:p>
+    <w:p>
+      <w:r>
+        <w:br w:type="page"/>
+      </w:r>
+    </w:p>
+    <w:p>
+      <w:pPr>
+        <w:pStyle w:val="Heading1"/>
+      </w:pPr>
+      <w:r>
+        <w:t>Bijlage C — Open punten</w:t>
       </w:r>
     </w:p>
     <w:p>
@@ -2810,7 +3359,7 @@
           </w:tcPr>
           <w:p>
             <w:r>
-              <w:t>Standaard 99999 (= altijd doorrekenen). Vastgesteld worden met business.</w:t>
+              <w:t>Standaard 99999 (= altijd doorrekenen). Vast te stellen met business.</w:t>
             </w:r>
           </w:p>
         </w:tc>
@@ -2842,7 +3391,7 @@
           </w:tcPr>
           <w:p>
             <w:r>
-              <w:t>Standaard 99999. Vastgesteld worden met business.</w:t>
+              <w:t>Standaard 99999. Vast te stellen met business.</w:t>
             </w:r>
           </w:p>
         </w:tc>
@@ -2943,34 +3492,271 @@
           </w:p>
         </w:tc>
       </w:tr>
+    </w:tbl>
+    <w:p/>
+    <w:p>
+      <w:pPr>
+        <w:pStyle w:val="Heading1"/>
+      </w:pPr>
+      <w:r>
+        <w:t>Bijlage D — Wijzigingshistorie</w:t>
+      </w:r>
+    </w:p>
+    <w:tbl>
+      <w:tblPr>
+        <w:tblStyle w:val="LightGrid-Accent1"/>
+        <w:tblW w:type="auto" w:w="0"/>
+        <w:jc w:val="left"/>
+        <w:tblLook w:firstColumn="1" w:firstRow="1" w:lastColumn="0" w:lastRow="0" w:noHBand="0" w:noVBand="1" w:val="04A0"/>
+      </w:tblPr>
+      <w:tblGrid>
+        <w:gridCol w:w="4320"/>
+        <w:gridCol w:w="4320"/>
+      </w:tblGrid>
       <w:tr>
         <w:tc>
           <w:tcPr>
-            <w:tcW w:type="dxa" w:w="2880"/>
+            <w:tcW w:type="dxa" w:w="4320"/>
           </w:tcPr>
           <w:p>
             <w:r>
-              <w:t>6</w:t>
+              <w:rPr>
+                <w:b/>
+              </w:rPr>
+              <w:t>Versie</w:t>
             </w:r>
           </w:p>
         </w:tc>
         <w:tc>
           <w:tcPr>
-            <w:tcW w:type="dxa" w:w="2880"/>
+            <w:tcW w:type="dxa" w:w="4320"/>
           </w:tcPr>
           <w:p>
             <w:r>
-              <w:t>Carrier-koppeling</w:t>
+              <w:rPr>
+                <w:b/>
+              </w:rPr>
+              <w:t>Wijziging</w:t>
+            </w:r>
+          </w:p>
+        </w:tc>
+      </w:tr>
+      <w:tr>
+        <w:tc>
+          <w:tcPr>
+            <w:tcW w:type="dxa" w:w="4320"/>
+          </w:tcPr>
+          <w:p>
+            <w:r>
+              <w:t>1.9</w:t>
             </w:r>
           </w:p>
         </w:tc>
         <w:tc>
           <w:tcPr>
-            <w:tcW w:type="dxa" w:w="2880"/>
+            <w:tcW w:type="dxa" w:w="4320"/>
           </w:tcPr>
           <w:p>
             <w:r>
-              <w:t>Valt buiten scope. Geen verzendkoppeling met externe carriers.</w:t>
+              <w:t>Berekening wordt overgeslagen als de klant een vaste verzendwijze heeft (property_delivery_carrier_id); melding in de Chatter.</w:t>
+            </w:r>
+          </w:p>
+        </w:tc>
+      </w:tr>
+      <w:tr>
+        <w:tc>
+          <w:tcPr>
+            <w:tcW w:type="dxa" w:w="4320"/>
+          </w:tcPr>
+          <w:p>
+            <w:r>
+              <w:t>1.8</w:t>
+            </w:r>
+          </w:p>
+        </w:tc>
+        <w:tc>
+          <w:tcPr>
+            <w:tcW w:type="dxa" w:w="4320"/>
+          </w:tcPr>
+          <w:p>
+            <w:r>
+              <w:t>Maateenheid-bewust stukgewicht — detectie van lengte-eenheden (m, cm, mm …) via de product-maateenheid voor TK1/TK2/TK3.</w:t>
+            </w:r>
+          </w:p>
+        </w:tc>
+      </w:tr>
+      <w:tr>
+        <w:tc>
+          <w:tcPr>
+            <w:tcW w:type="dxa" w:w="4320"/>
+          </w:tcPr>
+          <w:p>
+            <w:r>
+              <w:t>1.7</w:t>
+            </w:r>
+          </w:p>
+        </w:tc>
+        <w:tc>
+          <w:tcPr>
+            <w:tcW w:type="dxa" w:w="4320"/>
+          </w:tcPr>
+          <w:p>
+            <w:r>
+              <w:t>Correctie stukgewicht TK1 voor per-meter verkochte producten (gewicht/m × lengte = werkelijk stukgewicht).</w:t>
+            </w:r>
+          </w:p>
+        </w:tc>
+      </w:tr>
+      <w:tr>
+        <w:tc>
+          <w:tcPr>
+            <w:tcW w:type="dxa" w:w="4320"/>
+          </w:tcPr>
+          <w:p>
+            <w:r>
+              <w:t>1.6</w:t>
+            </w:r>
+          </w:p>
+        </w:tc>
+        <w:tc>
+          <w:tcPr>
+            <w:tcW w:type="dxa" w:w="4320"/>
+          </w:tcPr>
+          <w:p>
+            <w:r>
+              <w:t>Product van de transporteur wordt gebruikt voor de transportkosten-regel; correctie m→cm in TK1.</w:t>
+            </w:r>
+          </w:p>
+        </w:tc>
+      </w:tr>
+      <w:tr>
+        <w:tc>
+          <w:tcPr>
+            <w:tcW w:type="dxa" w:w="4320"/>
+          </w:tcPr>
+          <w:p>
+            <w:r>
+              <w:t>1.5</w:t>
+            </w:r>
+          </w:p>
+        </w:tc>
+        <w:tc>
+          <w:tcPr>
+            <w:tcW w:type="dxa" w:w="4320"/>
+          </w:tcPr>
+          <w:p>
+            <w:r>
+              <w:t>i18n — labels Hoeveelheid/Aantal (nl_NL).</w:t>
+            </w:r>
+          </w:p>
+        </w:tc>
+      </w:tr>
+      <w:tr>
+        <w:tc>
+          <w:tcPr>
+            <w:tcW w:type="dxa" w:w="4320"/>
+          </w:tcPr>
+          <w:p>
+            <w:r>
+              <w:t>1.4</w:t>
+            </w:r>
+          </w:p>
+        </w:tc>
+        <w:tc>
+          <w:tcPr>
+            <w:tcW w:type="dxa" w:w="4320"/>
+          </w:tcPr>
+          <w:p>
+            <w:r>
+              <w:t>i18n — Engelse bronteksten, Nederlandse (nl_NL) vertalingen.</w:t>
+            </w:r>
+          </w:p>
+        </w:tc>
+      </w:tr>
+      <w:tr>
+        <w:tc>
+          <w:tcPr>
+            <w:tcW w:type="dxa" w:w="4320"/>
+          </w:tcPr>
+          <w:p>
+            <w:r>
+              <w:t>1.3</w:t>
+            </w:r>
+          </w:p>
+        </w:tc>
+        <w:tc>
+          <w:tcPr>
+            <w:tcW w:type="dxa" w:w="4320"/>
+          </w:tcPr>
+          <w:p>
+            <w:r>
+              <w:t>Transporteurbepaling (prioriteit TK1 &gt; TK3 &gt; TK2); Lengte/Hoeveelheid op orderregels.</w:t>
+            </w:r>
+          </w:p>
+        </w:tc>
+      </w:tr>
+      <w:tr>
+        <w:tc>
+          <w:tcPr>
+            <w:tcW w:type="dxa" w:w="4320"/>
+          </w:tcPr>
+          <w:p>
+            <w:r>
+              <w:t>1.2</w:t>
+            </w:r>
+          </w:p>
+        </w:tc>
+        <w:tc>
+          <w:tcPr>
+            <w:tcW w:type="dxa" w:w="4320"/>
+          </w:tcPr>
+          <w:p>
+            <w:r>
+              <w:t>Velden Hoeveelheid/Lengte op orderregels + native berekening (vervangt Studio-automatiseringen).</w:t>
+            </w:r>
+          </w:p>
+        </w:tc>
+      </w:tr>
+      <w:tr>
+        <w:tc>
+          <w:tcPr>
+            <w:tcW w:type="dxa" w:w="4320"/>
+          </w:tcPr>
+          <w:p>
+            <w:r>
+              <w:t>1.1</w:t>
+            </w:r>
+          </w:p>
+        </w:tc>
+        <w:tc>
+          <w:tcPr>
+            <w:tcW w:type="dxa" w:w="4320"/>
+          </w:tcPr>
+          <w:p>
+            <w:r>
+              <w:t>Gewichtsbanding per stuk voor TK1/TK2 (zwaar/midden/licht).</w:t>
+            </w:r>
+          </w:p>
+        </w:tc>
+      </w:tr>
+      <w:tr>
+        <w:tc>
+          <w:tcPr>
+            <w:tcW w:type="dxa" w:w="4320"/>
+          </w:tcPr>
+          <w:p>
+            <w:r>
+              <w:t>1.0</w:t>
+            </w:r>
+          </w:p>
+        </w:tc>
+        <w:tc>
+          <w:tcPr>
+            <w:tcW w:type="dxa" w:w="4320"/>
+          </w:tcPr>
+          <w:p>
+            <w:r>
+              <w:t>Eerste versie — transportkostenberekening voor TK1/TK2/TK3.</w:t>
             </w:r>
           </w:p>
         </w:tc>

</xml_diff>